<commit_message>
fix(laboratorio): anchos de columna del Anexo 1 y una repetición menos
Las tablas por componente se armaban con `add_table` en tercios iguales, así
que la columna `Estado` —una letra— se quedaba con 5 cm de hoja y el `Motivo` se
envolvía en una franja de otros 5. La plantilla oficial define los anchos
desiguales; ahora los respeta: `Atributo` 5,0 cm, `Estado` 1,7 cm y `Motivo`
8,3 cm.

Los anchos se guardan en centímetros y se convierten dentro del emisor: importar
`python-docx` a nivel de módulo rompía la colección de la suite, que carga el
script por importlib sin esa dependencia opcional.

Se quita además una repetición: la descripción del ambiente de demostración
aparecía igual en el enfoque del proyecto y otra vez en el estado TRL.

Manifiesto de versión regenerado.
</commit_message>
<xml_diff>
--- a/Documentos/Laboratorio/Anexo1-Presentacion-v1.docx
+++ b/Documentos/Laboratorio/Anexo1-Presentacion-v1.docx
@@ -206,7 +206,7 @@
     </w:p>
     <w:p>
       <w:r>
-        <w:t>Demostrado sobre el sistema de demostración. El sistema corre de punta a punta en la laptop del autor con modelo local (Ollama) y sobre Google Workspace D2 con la cuenta técnica; la corrida live del 28/09/2026 quedó verificada con smoke de lectura, casos negativos y un extremo a extremo de gacetilla cuyo borrador real quedó en la carpeta autorizada, sin modificar nada existente. HU-010 a HU-014 están implementadas dentro del alcance declarado —gacetilla, post, plantilla de correo por actividad y certificado con línea descriptiva y circuito de lote—, la suite y las matrices por historia las ejercitan, y cada fila A o B de las tablas por estrato cita su evidencia versionada y su paso en vivo.</w:t>
+        <w:t>Demostrado sobre el sistema de demostración. La corrida live del 28/09/2026 quedó verificada con smoke de lectura, casos negativos y un extremo a extremo de gacetilla cuyo borrador real quedó en la carpeta autorizada, sin modificar nada existente. HU-010 a HU-014 están implementadas dentro del alcance declarado —gacetilla, post, plantilla de correo por actividad y certificado con línea descriptiva y circuito de lote—, la suite y las matrices por historia las ejercitan, y cada fila A o B de las tablas por estrato cita su evidencia versionada y su paso en vivo.</w:t>
       </w:r>
     </w:p>
     <w:p>
@@ -419,6 +419,7 @@
       <w:tblPr>
         <w:tblStyle w:val="Tablaconcuadrcula"/>
         <w:tblW w:type="auto" w:w="0"/>
+        <w:tblLayout w:type="fixed"/>
         <w:tblLook w:firstColumn="1" w:firstRow="1" w:lastColumn="0" w:lastRow="0" w:noHBand="0" w:noVBand="1" w:val="04A0"/>
       </w:tblPr>
       <w:tblGrid>
@@ -452,7 +453,7 @@
         </w:tc>
         <w:tc>
           <w:tcPr>
-            <w:tcW w:type="dxa" w:w="2835"/>
+            <w:tcW w:type="dxa" w:w="964"/>
           </w:tcPr>
           <w:p>
             <w:r>
@@ -462,7 +463,7 @@
         </w:tc>
         <w:tc>
           <w:tcPr>
-            <w:tcW w:type="dxa" w:w="2835"/>
+            <w:tcW w:type="dxa" w:w="4706"/>
           </w:tcPr>
           <w:p>
             <w:r>
@@ -673,6 +674,7 @@
       <w:tblPr>
         <w:tblStyle w:val="Tablaconcuadrcula"/>
         <w:tblW w:type="auto" w:w="0"/>
+        <w:tblLayout w:type="fixed"/>
         <w:tblLook w:firstColumn="1" w:firstRow="1" w:lastColumn="0" w:lastRow="0" w:noHBand="0" w:noVBand="1" w:val="04A0"/>
       </w:tblPr>
       <w:tblGrid>
@@ -706,7 +708,7 @@
         </w:tc>
         <w:tc>
           <w:tcPr>
-            <w:tcW w:type="dxa" w:w="2835"/>
+            <w:tcW w:type="dxa" w:w="964"/>
           </w:tcPr>
           <w:p>
             <w:r>
@@ -716,7 +718,7 @@
         </w:tc>
         <w:tc>
           <w:tcPr>
-            <w:tcW w:type="dxa" w:w="2835"/>
+            <w:tcW w:type="dxa" w:w="4706"/>
           </w:tcPr>
           <w:p>
             <w:r>
@@ -895,6 +897,7 @@
       <w:tblPr>
         <w:tblStyle w:val="Tablaconcuadrcula"/>
         <w:tblW w:type="auto" w:w="0"/>
+        <w:tblLayout w:type="fixed"/>
         <w:tblLook w:firstColumn="1" w:firstRow="1" w:lastColumn="0" w:lastRow="0" w:noHBand="0" w:noVBand="1" w:val="04A0"/>
       </w:tblPr>
       <w:tblGrid>
@@ -928,7 +931,7 @@
         </w:tc>
         <w:tc>
           <w:tcPr>
-            <w:tcW w:type="dxa" w:w="2835"/>
+            <w:tcW w:type="dxa" w:w="964"/>
           </w:tcPr>
           <w:p>
             <w:r>
@@ -938,7 +941,7 @@
         </w:tc>
         <w:tc>
           <w:tcPr>
-            <w:tcW w:type="dxa" w:w="2835"/>
+            <w:tcW w:type="dxa" w:w="4706"/>
           </w:tcPr>
           <w:p>
             <w:r>
@@ -1277,6 +1280,7 @@
       <w:tblPr>
         <w:tblStyle w:val="Tablaconcuadrcula"/>
         <w:tblW w:type="auto" w:w="0"/>
+        <w:tblLayout w:type="fixed"/>
         <w:tblLook w:firstColumn="1" w:firstRow="1" w:lastColumn="0" w:lastRow="0" w:noHBand="0" w:noVBand="1" w:val="04A0"/>
       </w:tblPr>
       <w:tblGrid>
@@ -1310,7 +1314,7 @@
         </w:tc>
         <w:tc>
           <w:tcPr>
-            <w:tcW w:type="dxa" w:w="2835"/>
+            <w:tcW w:type="dxa" w:w="964"/>
           </w:tcPr>
           <w:p>
             <w:r>
@@ -1320,7 +1324,7 @@
         </w:tc>
         <w:tc>
           <w:tcPr>
-            <w:tcW w:type="dxa" w:w="2835"/>
+            <w:tcW w:type="dxa" w:w="4706"/>
           </w:tcPr>
           <w:p>
             <w:r>
@@ -1467,6 +1471,7 @@
       <w:tblPr>
         <w:tblStyle w:val="Tablaconcuadrcula"/>
         <w:tblW w:type="auto" w:w="0"/>
+        <w:tblLayout w:type="fixed"/>
         <w:tblLook w:firstColumn="1" w:firstRow="1" w:lastColumn="0" w:lastRow="0" w:noHBand="0" w:noVBand="1" w:val="04A0"/>
       </w:tblPr>
       <w:tblGrid>
@@ -1500,7 +1505,7 @@
         </w:tc>
         <w:tc>
           <w:tcPr>
-            <w:tcW w:type="dxa" w:w="2835"/>
+            <w:tcW w:type="dxa" w:w="964"/>
           </w:tcPr>
           <w:p>
             <w:r>
@@ -1510,7 +1515,7 @@
         </w:tc>
         <w:tc>
           <w:tcPr>
-            <w:tcW w:type="dxa" w:w="2835"/>
+            <w:tcW w:type="dxa" w:w="4706"/>
           </w:tcPr>
           <w:p>
             <w:r>
@@ -1753,6 +1758,7 @@
       <w:tblPr>
         <w:tblStyle w:val="Tablaconcuadrcula"/>
         <w:tblW w:type="auto" w:w="0"/>
+        <w:tblLayout w:type="fixed"/>
         <w:tblLook w:firstColumn="1" w:firstRow="1" w:lastColumn="0" w:lastRow="0" w:noHBand="0" w:noVBand="1" w:val="04A0"/>
       </w:tblPr>
       <w:tblGrid>
@@ -1786,7 +1792,7 @@
         </w:tc>
         <w:tc>
           <w:tcPr>
-            <w:tcW w:type="dxa" w:w="2835"/>
+            <w:tcW w:type="dxa" w:w="964"/>
           </w:tcPr>
           <w:p>
             <w:r>
@@ -1796,7 +1802,7 @@
         </w:tc>
         <w:tc>
           <w:tcPr>
-            <w:tcW w:type="dxa" w:w="2835"/>
+            <w:tcW w:type="dxa" w:w="4706"/>
           </w:tcPr>
           <w:p>
             <w:r>
@@ -2039,6 +2045,7 @@
       <w:tblPr>
         <w:tblStyle w:val="Tablaconcuadrcula"/>
         <w:tblW w:type="auto" w:w="0"/>
+        <w:tblLayout w:type="fixed"/>
         <w:tblLook w:firstColumn="1" w:firstRow="1" w:lastColumn="0" w:lastRow="0" w:noHBand="0" w:noVBand="1" w:val="04A0"/>
       </w:tblPr>
       <w:tblGrid>
@@ -2072,7 +2079,7 @@
         </w:tc>
         <w:tc>
           <w:tcPr>
-            <w:tcW w:type="dxa" w:w="2835"/>
+            <w:tcW w:type="dxa" w:w="964"/>
           </w:tcPr>
           <w:p>
             <w:r>
@@ -2082,7 +2089,7 @@
         </w:tc>
         <w:tc>
           <w:tcPr>
-            <w:tcW w:type="dxa" w:w="2835"/>
+            <w:tcW w:type="dxa" w:w="4706"/>
           </w:tcPr>
           <w:p>
             <w:r>
@@ -2293,6 +2300,7 @@
       <w:tblPr>
         <w:tblStyle w:val="Tablaconcuadrcula"/>
         <w:tblW w:type="auto" w:w="0"/>
+        <w:tblLayout w:type="fixed"/>
         <w:tblLook w:firstColumn="1" w:firstRow="1" w:lastColumn="0" w:lastRow="0" w:noHBand="0" w:noVBand="1" w:val="04A0"/>
       </w:tblPr>
       <w:tblGrid>
@@ -2326,7 +2334,7 @@
         </w:tc>
         <w:tc>
           <w:tcPr>
-            <w:tcW w:type="dxa" w:w="2835"/>
+            <w:tcW w:type="dxa" w:w="964"/>
           </w:tcPr>
           <w:p>
             <w:r>
@@ -2336,7 +2344,7 @@
         </w:tc>
         <w:tc>
           <w:tcPr>
-            <w:tcW w:type="dxa" w:w="2835"/>
+            <w:tcW w:type="dxa" w:w="4706"/>
           </w:tcPr>
           <w:p>
             <w:r>
@@ -2483,6 +2491,7 @@
       <w:tblPr>
         <w:tblStyle w:val="Tablaconcuadrcula"/>
         <w:tblW w:type="auto" w:w="0"/>
+        <w:tblLayout w:type="fixed"/>
         <w:tblLook w:firstColumn="1" w:firstRow="1" w:lastColumn="0" w:lastRow="0" w:noHBand="0" w:noVBand="1" w:val="04A0"/>
       </w:tblPr>
       <w:tblGrid>
@@ -2516,7 +2525,7 @@
         </w:tc>
         <w:tc>
           <w:tcPr>
-            <w:tcW w:type="dxa" w:w="2835"/>
+            <w:tcW w:type="dxa" w:w="964"/>
           </w:tcPr>
           <w:p>
             <w:r>
@@ -2526,7 +2535,7 @@
         </w:tc>
         <w:tc>
           <w:tcPr>
-            <w:tcW w:type="dxa" w:w="2835"/>
+            <w:tcW w:type="dxa" w:w="4706"/>
           </w:tcPr>
           <w:p>
             <w:r>
@@ -2769,6 +2778,7 @@
       <w:tblPr>
         <w:tblStyle w:val="Tablaconcuadrcula"/>
         <w:tblW w:type="auto" w:w="0"/>
+        <w:tblLayout w:type="fixed"/>
         <w:tblLook w:firstColumn="1" w:firstRow="1" w:lastColumn="0" w:lastRow="0" w:noHBand="0" w:noVBand="1" w:val="04A0"/>
       </w:tblPr>
       <w:tblGrid>
@@ -2802,7 +2812,7 @@
         </w:tc>
         <w:tc>
           <w:tcPr>
-            <w:tcW w:type="dxa" w:w="2835"/>
+            <w:tcW w:type="dxa" w:w="964"/>
           </w:tcPr>
           <w:p>
             <w:r>
@@ -2812,7 +2822,7 @@
         </w:tc>
         <w:tc>
           <w:tcPr>
-            <w:tcW w:type="dxa" w:w="2835"/>
+            <w:tcW w:type="dxa" w:w="4706"/>
           </w:tcPr>
           <w:p>
             <w:r>

</xml_diff>